<commit_message>
Add Figure S1-S3 legends and document next steps for restructuring
- Add Title/Legend for Figure S1 (heatmap by DOW), S2 (heatmap by zone), S3 (parameter scatter)
- Document planned Main figure/table restructuring in figure_legends.txt

Co-Authored-By: Claude Sonnet 4.6 <noreply@anthropic.com>
</commit_message>
<xml_diff>
--- a/outputs/FiguresandTables_ver1.1.docx
+++ b/outputs/FiguresandTables_ver1.1.docx
@@ -8052,11 +8052,30 @@
     </w:p>
     <w:p>
       <w:pPr>
+        <w:widowControl/>
+        <w:jc w:val="left"/>
+        <w:rPr>
+          <w:rFonts w:ascii="Times New Roman" w:hAnsi="Times New Roman" w:cs="Times New Roman"/>
+          <w:sz w:val="22"/>
+          <w:szCs w:val="22"/>
+        </w:rPr>
+      </w:pPr>
+      <w:r>
+        <w:rPr>
+          <w:rFonts w:ascii="Times New Roman" w:hAnsi="Times New Roman" w:cs="Times New Roman"/>
+          <w:sz w:val="22"/>
+          <w:szCs w:val="22"/>
+        </w:rPr>
+        <w:br w:type="page"/>
+      </w:r>
+    </w:p>
+    <w:p>
+      <w:pPr>
         <w:tabs>
           <w:tab w:val="left" w:pos="1196"/>
         </w:tabs>
         <w:rPr>
-          <w:rFonts w:ascii="Times New Roman" w:hAnsi="Times New Roman" w:cs="Times New Roman" w:hint="eastAsia"/>
+          <w:rFonts w:ascii="Times New Roman" w:hAnsi="Times New Roman" w:cs="Times New Roman"/>
           <w:sz w:val="22"/>
           <w:szCs w:val="22"/>
         </w:rPr>
@@ -8067,8 +8086,479 @@
           <w:sz w:val="22"/>
           <w:szCs w:val="22"/>
         </w:rPr>
-        <w:t xml:space="preserve">                                                                                                                                     </w:t>
-      </w:r>
+        <w:lastRenderedPageBreak/>
+        <w:t xml:space="preserve">Figure S1. </w:t>
+      </w:r>
+      <w:r>
+        <w:rPr>
+          <w:rFonts w:ascii="Times New Roman" w:hAnsi="Times New Roman" w:cs="Times New Roman"/>
+          <w:sz w:val="22"/>
+          <w:szCs w:val="22"/>
+        </w:rPr>
+        <w:t>Temporal distribution of clinical alarms by hour of day and day of week</w:t>
+      </w:r>
+    </w:p>
+    <w:p>
+      <w:pPr>
+        <w:tabs>
+          <w:tab w:val="left" w:pos="1196"/>
+        </w:tabs>
+        <w:rPr>
+          <w:rFonts w:ascii="Times New Roman" w:hAnsi="Times New Roman" w:cs="Times New Roman"/>
+          <w:sz w:val="22"/>
+          <w:szCs w:val="22"/>
+        </w:rPr>
+      </w:pPr>
+      <w:r>
+        <w:rPr>
+          <w:rFonts w:ascii="Times New Roman" w:hAnsi="Times New Roman" w:cs="Times New Roman"/>
+          <w:sz w:val="22"/>
+          <w:szCs w:val="22"/>
+        </w:rPr>
+        <w:t xml:space="preserve"> </w:t>
+      </w:r>
+      <w:r>
+        <w:rPr>
+          <w:rFonts w:ascii="Times New Roman" w:hAnsi="Times New Roman" w:cs="Times New Roman"/>
+          <w:noProof/>
+          <w:sz w:val="22"/>
+          <w:szCs w:val="22"/>
+        </w:rPr>
+        <w:drawing>
+          <wp:inline distT="0" distB="0" distL="0" distR="0" wp14:anchorId="717D4987" wp14:editId="762E02A1">
+            <wp:extent cx="3200400" cy="4114800"/>
+            <wp:effectExtent l="0" t="0" r="0" b="0"/>
+            <wp:docPr id="1501966517" name="図 1"/>
+            <wp:cNvGraphicFramePr>
+              <a:graphicFrameLocks xmlns:a="http://schemas.openxmlformats.org/drawingml/2006/main" noChangeAspect="1"/>
+            </wp:cNvGraphicFramePr>
+            <a:graphic xmlns:a="http://schemas.openxmlformats.org/drawingml/2006/main">
+              <a:graphicData uri="http://schemas.openxmlformats.org/drawingml/2006/picture">
+                <pic:pic xmlns:pic="http://schemas.openxmlformats.org/drawingml/2006/picture">
+                  <pic:nvPicPr>
+                    <pic:cNvPr id="1501966517" name="図 1501966517"/>
+                    <pic:cNvPicPr/>
+                  </pic:nvPicPr>
+                  <pic:blipFill>
+                    <a:blip r:embed="rId5"/>
+                    <a:stretch>
+                      <a:fillRect/>
+                    </a:stretch>
+                  </pic:blipFill>
+                  <pic:spPr>
+                    <a:xfrm>
+                      <a:off x="0" y="0"/>
+                      <a:ext cx="3200400" cy="4114800"/>
+                    </a:xfrm>
+                    <a:prstGeom prst="rect">
+                      <a:avLst/>
+                    </a:prstGeom>
+                  </pic:spPr>
+                </pic:pic>
+              </a:graphicData>
+            </a:graphic>
+          </wp:inline>
+        </w:drawing>
+      </w:r>
+    </w:p>
+    <w:p>
+      <w:pPr>
+        <w:tabs>
+          <w:tab w:val="left" w:pos="1196"/>
+        </w:tabs>
+        <w:rPr>
+          <w:rFonts w:ascii="Times New Roman" w:hAnsi="Times New Roman" w:cs="Times New Roman"/>
+          <w:sz w:val="22"/>
+          <w:szCs w:val="22"/>
+        </w:rPr>
+      </w:pPr>
+      <w:r>
+        <w:rPr>
+          <w:rFonts w:ascii="Times New Roman" w:hAnsi="Times New Roman" w:cs="Times New Roman"/>
+          <w:sz w:val="22"/>
+          <w:szCs w:val="22"/>
+        </w:rPr>
+        <w:t>Heatmap showing the distribution of clinical alarms across hours of the day (x-axis, 0–23h)</w:t>
+      </w:r>
+      <w:r>
+        <w:rPr>
+          <w:rFonts w:ascii="Times New Roman" w:hAnsi="Times New Roman" w:cs="Times New Roman"/>
+          <w:sz w:val="22"/>
+          <w:szCs w:val="22"/>
+        </w:rPr>
+        <w:t xml:space="preserve"> </w:t>
+      </w:r>
+      <w:r>
+        <w:rPr>
+          <w:rFonts w:ascii="Times New Roman" w:hAnsi="Times New Roman" w:cs="Times New Roman"/>
+          <w:sz w:val="22"/>
+          <w:szCs w:val="22"/>
+        </w:rPr>
+        <w:t>and days of the week (y-axis, Monday to Sunday), stratified by priority level (ADVISORY,</w:t>
+      </w:r>
+      <w:r>
+        <w:rPr>
+          <w:rFonts w:ascii="Times New Roman" w:hAnsi="Times New Roman" w:cs="Times New Roman"/>
+          <w:sz w:val="22"/>
+          <w:szCs w:val="22"/>
+        </w:rPr>
+        <w:t xml:space="preserve"> </w:t>
+      </w:r>
+      <w:r>
+        <w:rPr>
+          <w:rFonts w:ascii="Times New Roman" w:hAnsi="Times New Roman" w:cs="Times New Roman"/>
+          <w:sz w:val="22"/>
+          <w:szCs w:val="22"/>
+        </w:rPr>
+        <w:t>WARNING, CRISIS). Each cell represents the total alarm count for that hour–day combination</w:t>
+      </w:r>
+      <w:r>
+        <w:rPr>
+          <w:rFonts w:ascii="Times New Roman" w:hAnsi="Times New Roman" w:cs="Times New Roman"/>
+          <w:sz w:val="22"/>
+          <w:szCs w:val="22"/>
+        </w:rPr>
+        <w:t xml:space="preserve"> </w:t>
+      </w:r>
+      <w:r>
+        <w:rPr>
+          <w:rFonts w:ascii="Times New Roman" w:hAnsi="Times New Roman" w:cs="Times New Roman"/>
+          <w:sz w:val="22"/>
+          <w:szCs w:val="22"/>
+        </w:rPr>
+        <w:t>over the 57-day observation period (July 15 – September 9, 2025). Color intensity reflects</w:t>
+      </w:r>
+      <w:r>
+        <w:rPr>
+          <w:rFonts w:ascii="Times New Roman" w:hAnsi="Times New Roman" w:cs="Times New Roman"/>
+          <w:sz w:val="22"/>
+          <w:szCs w:val="22"/>
+        </w:rPr>
+        <w:t xml:space="preserve"> </w:t>
+      </w:r>
+      <w:r>
+        <w:rPr>
+          <w:rFonts w:ascii="Times New Roman" w:hAnsi="Times New Roman" w:cs="Times New Roman"/>
+          <w:sz w:val="22"/>
+          <w:szCs w:val="22"/>
+        </w:rPr>
+        <w:t>alarm frequency; higher counts appear in darker shades. Only clinical alarms are included</w:t>
+      </w:r>
+      <w:r>
+        <w:rPr>
+          <w:rFonts w:ascii="Times New Roman" w:hAnsi="Times New Roman" w:cs="Times New Roman"/>
+          <w:sz w:val="22"/>
+          <w:szCs w:val="22"/>
+        </w:rPr>
+        <w:t xml:space="preserve"> </w:t>
+      </w:r>
+      <w:r>
+        <w:rPr>
+          <w:rFonts w:ascii="Times New Roman" w:hAnsi="Times New Roman" w:cs="Times New Roman"/>
+          <w:sz w:val="22"/>
+          <w:szCs w:val="22"/>
+        </w:rPr>
+        <w:t>(N = 59,113). Daytime clustering (approximately 08:00–20:00) is apparent across all priority</w:t>
+      </w:r>
+      <w:r>
+        <w:rPr>
+          <w:rFonts w:ascii="Times New Roman" w:hAnsi="Times New Roman" w:cs="Times New Roman"/>
+          <w:sz w:val="22"/>
+          <w:szCs w:val="22"/>
+        </w:rPr>
+        <w:t xml:space="preserve"> </w:t>
+      </w:r>
+      <w:r>
+        <w:rPr>
+          <w:rFonts w:ascii="Times New Roman" w:hAnsi="Times New Roman" w:cs="Times New Roman"/>
+          <w:sz w:val="22"/>
+          <w:szCs w:val="22"/>
+        </w:rPr>
+        <w:t>levels, consistent with patient care activity patterns.</w:t>
+      </w:r>
+    </w:p>
+    <w:p>
+      <w:pPr>
+        <w:widowControl/>
+        <w:jc w:val="left"/>
+        <w:rPr>
+          <w:rFonts w:ascii="Times New Roman" w:hAnsi="Times New Roman" w:cs="Times New Roman"/>
+          <w:sz w:val="22"/>
+          <w:szCs w:val="22"/>
+        </w:rPr>
+      </w:pPr>
+      <w:r>
+        <w:rPr>
+          <w:rFonts w:ascii="Times New Roman" w:hAnsi="Times New Roman" w:cs="Times New Roman"/>
+          <w:sz w:val="22"/>
+          <w:szCs w:val="22"/>
+        </w:rPr>
+        <w:br w:type="page"/>
+      </w:r>
+    </w:p>
+    <w:p>
+      <w:pPr>
+        <w:tabs>
+          <w:tab w:val="left" w:pos="1196"/>
+        </w:tabs>
+        <w:rPr>
+          <w:rFonts w:ascii="Times New Roman" w:hAnsi="Times New Roman" w:cs="Times New Roman"/>
+          <w:sz w:val="22"/>
+          <w:szCs w:val="22"/>
+        </w:rPr>
+      </w:pPr>
+      <w:r>
+        <w:rPr>
+          <w:rFonts w:ascii="Times New Roman" w:hAnsi="Times New Roman" w:cs="Times New Roman"/>
+          <w:sz w:val="22"/>
+          <w:szCs w:val="22"/>
+        </w:rPr>
+        <w:lastRenderedPageBreak/>
+        <w:t xml:space="preserve">Figure S2. </w:t>
+      </w:r>
+      <w:r>
+        <w:rPr>
+          <w:rFonts w:ascii="Times New Roman" w:hAnsi="Times New Roman" w:cs="Times New Roman"/>
+          <w:sz w:val="22"/>
+          <w:szCs w:val="22"/>
+        </w:rPr>
+        <w:t>Clinical alarm distribution by ward zone, hour of day, and day of week</w:t>
+      </w:r>
+    </w:p>
+    <w:p>
+      <w:pPr>
+        <w:tabs>
+          <w:tab w:val="left" w:pos="1196"/>
+        </w:tabs>
+        <w:rPr>
+          <w:rFonts w:ascii="Times New Roman" w:hAnsi="Times New Roman" w:cs="Times New Roman"/>
+          <w:sz w:val="22"/>
+          <w:szCs w:val="22"/>
+        </w:rPr>
+      </w:pPr>
+      <w:r>
+        <w:rPr>
+          <w:rFonts w:ascii="Times New Roman" w:hAnsi="Times New Roman" w:cs="Times New Roman"/>
+          <w:noProof/>
+          <w:sz w:val="22"/>
+          <w:szCs w:val="22"/>
+        </w:rPr>
+        <w:drawing>
+          <wp:inline distT="0" distB="0" distL="0" distR="0" wp14:anchorId="5FB7A919" wp14:editId="3378A182">
+            <wp:extent cx="6188710" cy="5304790"/>
+            <wp:effectExtent l="0" t="0" r="0" b="3810"/>
+            <wp:docPr id="850472731" name="図 3"/>
+            <wp:cNvGraphicFramePr>
+              <a:graphicFrameLocks xmlns:a="http://schemas.openxmlformats.org/drawingml/2006/main" noChangeAspect="1"/>
+            </wp:cNvGraphicFramePr>
+            <a:graphic xmlns:a="http://schemas.openxmlformats.org/drawingml/2006/main">
+              <a:graphicData uri="http://schemas.openxmlformats.org/drawingml/2006/picture">
+                <pic:pic xmlns:pic="http://schemas.openxmlformats.org/drawingml/2006/picture">
+                  <pic:nvPicPr>
+                    <pic:cNvPr id="850472731" name="図 850472731"/>
+                    <pic:cNvPicPr/>
+                  </pic:nvPicPr>
+                  <pic:blipFill>
+                    <a:blip r:embed="rId6"/>
+                    <a:stretch>
+                      <a:fillRect/>
+                    </a:stretch>
+                  </pic:blipFill>
+                  <pic:spPr>
+                    <a:xfrm>
+                      <a:off x="0" y="0"/>
+                      <a:ext cx="6188710" cy="5304790"/>
+                    </a:xfrm>
+                    <a:prstGeom prst="rect">
+                      <a:avLst/>
+                    </a:prstGeom>
+                  </pic:spPr>
+                </pic:pic>
+              </a:graphicData>
+            </a:graphic>
+          </wp:inline>
+        </w:drawing>
+      </w:r>
+    </w:p>
+    <w:p>
+      <w:pPr>
+        <w:tabs>
+          <w:tab w:val="left" w:pos="1196"/>
+        </w:tabs>
+        <w:rPr>
+          <w:rFonts w:ascii="Times New Roman" w:hAnsi="Times New Roman" w:cs="Times New Roman"/>
+          <w:sz w:val="22"/>
+          <w:szCs w:val="22"/>
+        </w:rPr>
+      </w:pPr>
+      <w:r>
+        <w:rPr>
+          <w:rFonts w:ascii="Times New Roman" w:hAnsi="Times New Roman" w:cs="Times New Roman"/>
+          <w:sz w:val="22"/>
+          <w:szCs w:val="22"/>
+        </w:rPr>
+        <w:t>Six-panel heatmap comparing the temporal distribution of clinical alarms between the</w:t>
+      </w:r>
+      <w:r>
+        <w:rPr>
+          <w:rFonts w:ascii="Times New Roman" w:hAnsi="Times New Roman" w:cs="Times New Roman"/>
+          <w:sz w:val="22"/>
+          <w:szCs w:val="22"/>
+        </w:rPr>
+        <w:t xml:space="preserve"> </w:t>
+      </w:r>
+      <w:r>
+        <w:rPr>
+          <w:rFonts w:ascii="Times New Roman" w:hAnsi="Times New Roman" w:cs="Times New Roman"/>
+          <w:sz w:val="22"/>
+          <w:szCs w:val="22"/>
+        </w:rPr>
+        <w:t>high-acuity zone (12 beds) and the general zone</w:t>
+      </w:r>
+      <w:r>
+        <w:rPr>
+          <w:rFonts w:ascii="Times New Roman" w:hAnsi="Times New Roman" w:cs="Times New Roman"/>
+          <w:sz w:val="22"/>
+          <w:szCs w:val="22"/>
+        </w:rPr>
+        <w:t xml:space="preserve"> </w:t>
+      </w:r>
+      <w:r>
+        <w:rPr>
+          <w:rFonts w:ascii="Times New Roman" w:hAnsi="Times New Roman" w:cs="Times New Roman"/>
+          <w:sz w:val="22"/>
+          <w:szCs w:val="22"/>
+        </w:rPr>
+        <w:t>(29 beds), stratified by priority level (rows: ADVISORY, WARNING, CRISIS) and ward zone (columns: high-acuity, general). Each cell represents the total alarm count for a given</w:t>
+      </w:r>
+      <w:r>
+        <w:rPr>
+          <w:rFonts w:ascii="Times New Roman" w:hAnsi="Times New Roman" w:cs="Times New Roman"/>
+          <w:sz w:val="22"/>
+          <w:szCs w:val="22"/>
+        </w:rPr>
+        <w:t xml:space="preserve"> </w:t>
+      </w:r>
+      <w:r>
+        <w:rPr>
+          <w:rFonts w:ascii="Times New Roman" w:hAnsi="Times New Roman" w:cs="Times New Roman"/>
+          <w:sz w:val="22"/>
+          <w:szCs w:val="22"/>
+        </w:rPr>
+        <w:t>hour–day combination over the 57-day observation period. Color scales are unified within</w:t>
+      </w:r>
+      <w:r>
+        <w:rPr>
+          <w:rFonts w:ascii="Times New Roman" w:hAnsi="Times New Roman" w:cs="Times New Roman"/>
+          <w:sz w:val="22"/>
+          <w:szCs w:val="22"/>
+        </w:rPr>
+        <w:t xml:space="preserve"> </w:t>
+      </w:r>
+      <w:r>
+        <w:rPr>
+          <w:rFonts w:ascii="Times New Roman" w:hAnsi="Times New Roman" w:cs="Times New Roman"/>
+          <w:sz w:val="22"/>
+          <w:szCs w:val="22"/>
+        </w:rPr>
+        <w:t>each priority row to allow direct zone comparison. The high-acuity zone shows markedly</w:t>
+      </w:r>
+      <w:r>
+        <w:rPr>
+          <w:rFonts w:ascii="Times New Roman" w:hAnsi="Times New Roman" w:cs="Times New Roman"/>
+          <w:sz w:val="22"/>
+          <w:szCs w:val="22"/>
+        </w:rPr>
+        <w:t xml:space="preserve"> </w:t>
+      </w:r>
+      <w:r>
+        <w:rPr>
+          <w:rFonts w:ascii="Times New Roman" w:hAnsi="Times New Roman" w:cs="Times New Roman"/>
+          <w:sz w:val="22"/>
+          <w:szCs w:val="22"/>
+        </w:rPr>
+        <w:t>higher ADVISORY and CRISIS alarm density relative to bed count, reflecting the greater</w:t>
+      </w:r>
+      <w:r>
+        <w:rPr>
+          <w:rFonts w:ascii="Times New Roman" w:hAnsi="Times New Roman" w:cs="Times New Roman"/>
+          <w:sz w:val="22"/>
+          <w:szCs w:val="22"/>
+        </w:rPr>
+        <w:t xml:space="preserve"> </w:t>
+      </w:r>
+      <w:r>
+        <w:rPr>
+          <w:rFonts w:ascii="Times New Roman" w:hAnsi="Times New Roman" w:cs="Times New Roman"/>
+          <w:sz w:val="22"/>
+          <w:szCs w:val="22"/>
+        </w:rPr>
+        <w:t>clinical complexity of patients in that area.</w:t>
+      </w:r>
+    </w:p>
+    <w:p>
+      <w:pPr>
+        <w:widowControl/>
+        <w:jc w:val="left"/>
+        <w:rPr>
+          <w:rFonts w:ascii="Times New Roman" w:hAnsi="Times New Roman" w:cs="Times New Roman"/>
+          <w:sz w:val="22"/>
+          <w:szCs w:val="22"/>
+        </w:rPr>
+      </w:pPr>
+      <w:r>
+        <w:rPr>
+          <w:rFonts w:ascii="Times New Roman" w:hAnsi="Times New Roman" w:cs="Times New Roman"/>
+          <w:sz w:val="22"/>
+          <w:szCs w:val="22"/>
+        </w:rPr>
+        <w:br w:type="page"/>
+      </w:r>
+    </w:p>
+    <w:p>
+      <w:pPr>
+        <w:tabs>
+          <w:tab w:val="left" w:pos="1196"/>
+        </w:tabs>
+        <w:rPr>
+          <w:rFonts w:ascii="Times New Roman" w:hAnsi="Times New Roman" w:cs="Times New Roman"/>
+          <w:sz w:val="22"/>
+          <w:szCs w:val="22"/>
+        </w:rPr>
+      </w:pPr>
+      <w:r>
+        <w:rPr>
+          <w:rFonts w:ascii="Times New Roman" w:hAnsi="Times New Roman" w:cs="Times New Roman"/>
+          <w:sz w:val="22"/>
+          <w:szCs w:val="22"/>
+        </w:rPr>
+        <w:lastRenderedPageBreak/>
+        <w:t>Figure S3.</w:t>
+      </w:r>
+    </w:p>
+    <w:p>
+      <w:pPr>
+        <w:tabs>
+          <w:tab w:val="left" w:pos="1196"/>
+        </w:tabs>
+        <w:rPr>
+          <w:rFonts w:ascii="Times New Roman" w:hAnsi="Times New Roman" w:cs="Times New Roman"/>
+          <w:sz w:val="22"/>
+          <w:szCs w:val="22"/>
+        </w:rPr>
+      </w:pPr>
+    </w:p>
+    <w:p>
+      <w:pPr>
+        <w:tabs>
+          <w:tab w:val="left" w:pos="1196"/>
+        </w:tabs>
+        <w:rPr>
+          <w:rFonts w:ascii="Times New Roman" w:hAnsi="Times New Roman" w:cs="Times New Roman"/>
+          <w:sz w:val="22"/>
+          <w:szCs w:val="22"/>
+        </w:rPr>
+      </w:pPr>
     </w:p>
     <w:sectPr>
       <w:pgSz w:w="11906" w:h="16838"/>

</xml_diff>